<commit_message>
V1 - pequenas alterações
</commit_message>
<xml_diff>
--- a/1o semestre/030XXXX- Mecânica e Materiais 1.docx
+++ b/1o semestre/030XXXX- Mecânica e Materiais 1.docx
@@ -1691,7 +1691,19 @@
               <w:rPr>
                 <w:rFonts w:ascii="Arial" w:eastAsia="Arial" w:hAnsi="Arial" w:cs="Arial"/>
               </w:rPr>
-              <w:t>A disciplina em questão tem como foco o desenvolvimento das competências definidas para o curso de Engenharia Elétrica (Projeto Piloto) nas proporções estabelecidas pelo projeto pedagógico. Para isso, os seguintes Objetivos de Aprendizagem foram estabelecidos:</w:t>
+              <w:t xml:space="preserve">A disciplina em questão tem como foco o desenvolvimento das competências definidas para o curso de Engenharia </w:t>
+            </w:r>
+            <w:r>
+              <w:rPr>
+                <w:rFonts w:ascii="Arial" w:eastAsia="Arial" w:hAnsi="Arial" w:cs="Arial"/>
+              </w:rPr>
+              <w:t>Eletrônica e de Sistemas Computacionais</w:t>
+            </w:r>
+            <w:r>
+              <w:rPr>
+                <w:rFonts w:ascii="Arial" w:eastAsia="Arial" w:hAnsi="Arial" w:cs="Arial"/>
+              </w:rPr>
+              <w:t xml:space="preserve"> nas proporções estabelecidas pelo projeto pedagógico. Para isso, os seguintes Objetivos de Aprendizagem foram estabelecidos:</w:t>
             </w:r>
           </w:p>
           <w:p>
@@ -1718,13 +1730,15 @@
               </w:numPr>
               <w:rPr>
                 <w:rFonts w:ascii="Arial" w:eastAsia="Arial" w:hAnsi="Arial" w:cs="Arial"/>
-              </w:rPr>
-            </w:pPr>
-            <w:r>
-              <w:rPr>
-                <w:rFonts w:ascii="Arial" w:eastAsia="Arial" w:hAnsi="Arial" w:cs="Arial"/>
-              </w:rPr>
-              <w:t>Identificar principais componentes do sistema mecânicos;</w:t>
+                <w:lang w:val="pt-PT"/>
+              </w:rPr>
+            </w:pPr>
+            <w:r>
+              <w:rPr>
+                <w:rFonts w:ascii="Arial" w:eastAsia="Arial" w:hAnsi="Arial" w:cs="Arial"/>
+                <w:lang w:val="pt-PT"/>
+              </w:rPr>
+              <w:t>Dimensionar elementos de transmissão, sistemas de fixação e mancais de rolamento, aplicando critérios de seleção técnica para projetos mecânicos.</w:t>
             </w:r>
           </w:p>
           <w:p>
@@ -1736,13 +1750,15 @@
               </w:numPr>
               <w:rPr>
                 <w:rFonts w:ascii="Arial" w:eastAsia="Arial" w:hAnsi="Arial" w:cs="Arial"/>
-              </w:rPr>
-            </w:pPr>
-            <w:r>
-              <w:rPr>
-                <w:rFonts w:ascii="Arial" w:eastAsia="Arial" w:hAnsi="Arial" w:cs="Arial"/>
-              </w:rPr>
-              <w:t>Explicar diferentes tipos de esforços</w:t>
+                <w:lang w:val="pt-PT"/>
+              </w:rPr>
+            </w:pPr>
+            <w:r>
+              <w:rPr>
+                <w:rFonts w:ascii="Arial" w:eastAsia="Arial" w:hAnsi="Arial" w:cs="Arial"/>
+                <w:lang w:val="pt-PT"/>
+              </w:rPr>
+              <w:t>Determinar as reações de apoio em corpos rígidos submetidos a sistemas de forças no plano (2D), utilizando as equações fundamentais do equilíbrio estático.</w:t>
             </w:r>
           </w:p>
           <w:p>
@@ -1754,13 +1770,15 @@
               </w:numPr>
               <w:rPr>
                 <w:rFonts w:ascii="Arial" w:eastAsia="Arial" w:hAnsi="Arial" w:cs="Arial"/>
-              </w:rPr>
-            </w:pPr>
-            <w:r>
-              <w:rPr>
-                <w:rFonts w:ascii="Arial" w:eastAsia="Arial" w:hAnsi="Arial" w:cs="Arial"/>
-              </w:rPr>
-              <w:t>Conhecer origem das propriedades dos materiais</w:t>
+                <w:lang w:val="pt-PT"/>
+              </w:rPr>
+            </w:pPr>
+            <w:r>
+              <w:rPr>
+                <w:rFonts w:ascii="Arial" w:eastAsia="Arial" w:hAnsi="Arial" w:cs="Arial"/>
+                <w:lang w:val="pt-PT"/>
+              </w:rPr>
+              <w:t>Analisar a distribuição de esforços solicitantes (axial, cortante e momento fletor) em elementos de barra (1D) e estruturas planares (2D).</w:t>
             </w:r>
           </w:p>
           <w:p>
@@ -1772,13 +1790,15 @@
               </w:numPr>
               <w:rPr>
                 <w:rFonts w:ascii="Arial" w:eastAsia="Arial" w:hAnsi="Arial" w:cs="Arial"/>
-              </w:rPr>
-            </w:pPr>
-            <w:r>
-              <w:rPr>
-                <w:rFonts w:ascii="Arial" w:eastAsia="Arial" w:hAnsi="Arial" w:cs="Arial"/>
-              </w:rPr>
-              <w:t>Interpretar ensaios mecânicos</w:t>
+                <w:lang w:val="pt-PT"/>
+              </w:rPr>
+            </w:pPr>
+            <w:r>
+              <w:rPr>
+                <w:rFonts w:ascii="Arial" w:eastAsia="Arial" w:hAnsi="Arial" w:cs="Arial"/>
+                <w:lang w:val="pt-PT"/>
+              </w:rPr>
+              <w:t>Construir diagramas de esforços internos para a identificação de seções críticas em estruturas sujeitas a diferentes carregamentos.</w:t>
             </w:r>
           </w:p>
           <w:p>
@@ -1790,13 +1810,15 @@
               </w:numPr>
               <w:rPr>
                 <w:rFonts w:ascii="Arial" w:eastAsia="Arial" w:hAnsi="Arial" w:cs="Arial"/>
-              </w:rPr>
-            </w:pPr>
-            <w:r>
-              <w:rPr>
-                <w:rFonts w:ascii="Arial" w:eastAsia="Arial" w:hAnsi="Arial" w:cs="Arial"/>
-              </w:rPr>
-              <w:t>Comparar desempenho de diferentes materiais</w:t>
+                <w:lang w:val="pt-PT"/>
+              </w:rPr>
+            </w:pPr>
+            <w:r>
+              <w:rPr>
+                <w:rFonts w:ascii="Arial" w:eastAsia="Arial" w:hAnsi="Arial" w:cs="Arial"/>
+                <w:lang w:val="pt-PT"/>
+              </w:rPr>
+              <w:t>Correlacionar a natureza das ligações químicas com as propriedades mecânicas dos materiais, fundamentando a escolha de metais e polímeros em aplicações de engenharia.</w:t>
             </w:r>
           </w:p>
           <w:p>
@@ -1808,13 +1830,15 @@
               </w:numPr>
               <w:rPr>
                 <w:rFonts w:ascii="Arial" w:eastAsia="Arial" w:hAnsi="Arial" w:cs="Arial"/>
-              </w:rPr>
-            </w:pPr>
-            <w:r>
-              <w:rPr>
-                <w:rFonts w:ascii="Arial" w:eastAsia="Arial" w:hAnsi="Arial" w:cs="Arial"/>
-              </w:rPr>
-              <w:t>Calcular esforços em barras</w:t>
+                <w:lang w:val="pt-PT"/>
+              </w:rPr>
+            </w:pPr>
+            <w:r>
+              <w:rPr>
+                <w:rFonts w:ascii="Arial" w:eastAsia="Arial" w:hAnsi="Arial" w:cs="Arial"/>
+                <w:lang w:val="pt-PT"/>
+              </w:rPr>
+              <w:t>Executar ensaios mecânicos de tração e flexão em laboratório, interpretando curvas de tensão-deformação para a caracterização de alumínio e plásticos.</w:t>
             </w:r>
           </w:p>
           <w:p>
@@ -1826,13 +1850,15 @@
               </w:numPr>
               <w:rPr>
                 <w:rFonts w:ascii="Arial" w:eastAsia="Arial" w:hAnsi="Arial" w:cs="Arial"/>
-              </w:rPr>
-            </w:pPr>
-            <w:r>
-              <w:rPr>
-                <w:rFonts w:ascii="Arial" w:eastAsia="Arial" w:hAnsi="Arial" w:cs="Arial"/>
-              </w:rPr>
-              <w:t>Selecionar e usar sistemas de fixação</w:t>
+                <w:lang w:val="pt-PT"/>
+              </w:rPr>
+            </w:pPr>
+            <w:r>
+              <w:rPr>
+                <w:rFonts w:ascii="Arial" w:eastAsia="Arial" w:hAnsi="Arial" w:cs="Arial"/>
+                <w:lang w:val="pt-PT"/>
+              </w:rPr>
+              <w:t>Aplicar critérios de seleção de materiais e processos de fabricação baseados em requisitos de desempenho, custo e propriedades físicas.</w:t>
             </w:r>
           </w:p>
           <w:p>
@@ -1841,6 +1867,7 @@
               <w:ind w:left="720"/>
               <w:rPr>
                 <w:rFonts w:ascii="Arial" w:eastAsia="Arial" w:hAnsi="Arial" w:cs="Arial"/>
+                <w:lang w:val="pt-PT"/>
               </w:rPr>
             </w:pPr>
           </w:p>
@@ -1882,7 +1909,39 @@
                 <w:i/>
                 <w:lang w:val="en-US"/>
               </w:rPr>
-              <w:t xml:space="preserve">The discipline in question focuses on developing the competencies defined for the Electrical Engineering course (Pilot Project) in the proportions established by the pedagogical project. </w:t>
+              <w:t xml:space="preserve">The discipline in question focuses on developing the competencies defined for the </w:t>
+            </w:r>
+            <w:r>
+              <w:rPr>
+                <w:rFonts w:ascii="Arial" w:eastAsia="Arial" w:hAnsi="Arial" w:cs="Arial"/>
+                <w:i/>
+                <w:lang w:val="en-US"/>
+              </w:rPr>
+              <w:t xml:space="preserve">Electronic and Computational </w:t>
+            </w:r>
+            <w:r>
+              <w:rPr>
+                <w:rFonts w:ascii="Arial" w:eastAsia="Arial" w:hAnsi="Arial" w:cs="Arial"/>
+                <w:i/>
+                <w:lang w:val="en-US"/>
+              </w:rPr>
+              <w:t>Systems</w:t>
+            </w:r>
+            <w:r>
+              <w:rPr>
+                <w:rFonts w:ascii="Arial" w:eastAsia="Arial" w:hAnsi="Arial" w:cs="Arial"/>
+                <w:i/>
+                <w:lang w:val="en-US"/>
+              </w:rPr>
+              <w:t xml:space="preserve"> Engineering</w:t>
+            </w:r>
+            <w:r>
+              <w:rPr>
+                <w:rFonts w:ascii="Arial" w:eastAsia="Arial" w:hAnsi="Arial" w:cs="Arial"/>
+                <w:i/>
+                <w:lang w:val="en-US"/>
+              </w:rPr>
+              <w:t xml:space="preserve"> in the proportions established by the pedagogical project. </w:t>
             </w:r>
             <w:r>
               <w:rPr>
@@ -1920,16 +1979,16 @@
               <w:rPr>
                 <w:rFonts w:ascii="Arial" w:eastAsia="Arial" w:hAnsi="Arial" w:cs="Arial"/>
                 <w:i/>
-                <w:lang w:val="en-US"/>
-              </w:rPr>
-            </w:pPr>
-            <w:r>
-              <w:rPr>
-                <w:rFonts w:ascii="Arial" w:eastAsia="Arial" w:hAnsi="Arial" w:cs="Arial"/>
-                <w:i/>
-                <w:lang w:val="en-US"/>
-              </w:rPr>
-              <w:t>Identify the main components of mechanical systems</w:t>
+                <w:lang w:val="en-GB"/>
+              </w:rPr>
+            </w:pPr>
+            <w:r>
+              <w:rPr>
+                <w:rFonts w:ascii="Arial" w:eastAsia="Arial" w:hAnsi="Arial" w:cs="Arial"/>
+                <w:i/>
+                <w:lang w:val="en-GB"/>
+              </w:rPr>
+              <w:t>Size transmission elements, fastening systems, and rolling-element bearings by applying technical selection criteria for integrated mechanical projects.</w:t>
             </w:r>
           </w:p>
           <w:p>
@@ -1942,71 +2001,16 @@
               <w:rPr>
                 <w:rFonts w:ascii="Arial" w:eastAsia="Arial" w:hAnsi="Arial" w:cs="Arial"/>
                 <w:i/>
-              </w:rPr>
-            </w:pPr>
-            <w:proofErr w:type="spellStart"/>
-            <w:r>
-              <w:rPr>
-                <w:rFonts w:ascii="Arial" w:eastAsia="Arial" w:hAnsi="Arial" w:cs="Arial"/>
-                <w:i/>
-              </w:rPr>
-              <w:t>Explain</w:t>
-            </w:r>
-            <w:proofErr w:type="spellEnd"/>
-            <w:r>
-              <w:rPr>
-                <w:rFonts w:ascii="Arial" w:eastAsia="Arial" w:hAnsi="Arial" w:cs="Arial"/>
-                <w:i/>
-              </w:rPr>
-              <w:t xml:space="preserve"> </w:t>
-            </w:r>
-            <w:proofErr w:type="spellStart"/>
-            <w:r>
-              <w:rPr>
-                <w:rFonts w:ascii="Arial" w:eastAsia="Arial" w:hAnsi="Arial" w:cs="Arial"/>
-                <w:i/>
-              </w:rPr>
-              <w:t>different</w:t>
-            </w:r>
-            <w:proofErr w:type="spellEnd"/>
-            <w:r>
-              <w:rPr>
-                <w:rFonts w:ascii="Arial" w:eastAsia="Arial" w:hAnsi="Arial" w:cs="Arial"/>
-                <w:i/>
-              </w:rPr>
-              <w:t xml:space="preserve"> </w:t>
-            </w:r>
-            <w:proofErr w:type="spellStart"/>
-            <w:r>
-              <w:rPr>
-                <w:rFonts w:ascii="Arial" w:eastAsia="Arial" w:hAnsi="Arial" w:cs="Arial"/>
-                <w:i/>
-              </w:rPr>
-              <w:t>types</w:t>
-            </w:r>
-            <w:proofErr w:type="spellEnd"/>
-            <w:r>
-              <w:rPr>
-                <w:rFonts w:ascii="Arial" w:eastAsia="Arial" w:hAnsi="Arial" w:cs="Arial"/>
-                <w:i/>
-              </w:rPr>
-              <w:t xml:space="preserve"> </w:t>
-            </w:r>
-            <w:proofErr w:type="spellStart"/>
-            <w:r>
-              <w:rPr>
-                <w:rFonts w:ascii="Arial" w:eastAsia="Arial" w:hAnsi="Arial" w:cs="Arial"/>
-                <w:i/>
-              </w:rPr>
-              <w:t>of</w:t>
-            </w:r>
-            <w:proofErr w:type="spellEnd"/>
-            <w:r>
-              <w:rPr>
-                <w:rFonts w:ascii="Arial" w:eastAsia="Arial" w:hAnsi="Arial" w:cs="Arial"/>
-                <w:i/>
-              </w:rPr>
-              <w:t xml:space="preserve"> forces</w:t>
+                <w:lang w:val="en-GB"/>
+              </w:rPr>
+            </w:pPr>
+            <w:r>
+              <w:rPr>
+                <w:rFonts w:ascii="Arial" w:eastAsia="Arial" w:hAnsi="Arial" w:cs="Arial"/>
+                <w:i/>
+                <w:lang w:val="en-GB"/>
+              </w:rPr>
+              <w:t>Determine support reactions in rigid bodies subjected to force systems in the plane (2D), using the fundamental equations of static equilibrium.</w:t>
             </w:r>
           </w:p>
           <w:p>
@@ -2019,16 +2023,26 @@
               <w:rPr>
                 <w:rFonts w:ascii="Arial" w:eastAsia="Arial" w:hAnsi="Arial" w:cs="Arial"/>
                 <w:i/>
-                <w:lang w:val="en-US"/>
-              </w:rPr>
-            </w:pPr>
-            <w:r>
-              <w:rPr>
-                <w:rFonts w:ascii="Arial" w:eastAsia="Arial" w:hAnsi="Arial" w:cs="Arial"/>
-                <w:i/>
-                <w:lang w:val="en-US"/>
-              </w:rPr>
-              <w:t>Understand the origin of material properties</w:t>
+                <w:lang w:val="en-GB"/>
+              </w:rPr>
+            </w:pPr>
+            <w:proofErr w:type="spellStart"/>
+            <w:r>
+              <w:rPr>
+                <w:rFonts w:ascii="Arial" w:eastAsia="Arial" w:hAnsi="Arial" w:cs="Arial"/>
+                <w:i/>
+                <w:lang w:val="en-GB"/>
+              </w:rPr>
+              <w:t>Analyze</w:t>
+            </w:r>
+            <w:proofErr w:type="spellEnd"/>
+            <w:r>
+              <w:rPr>
+                <w:rFonts w:ascii="Arial" w:eastAsia="Arial" w:hAnsi="Arial" w:cs="Arial"/>
+                <w:i/>
+                <w:lang w:val="en-GB"/>
+              </w:rPr>
+              <w:t xml:space="preserve"> internal loading distribution (axial, shear, and bending moment) in beam elements (1D) and planar structures (2D).</w:t>
             </w:r>
           </w:p>
           <w:p>
@@ -2041,49 +2055,17 @@
               <w:rPr>
                 <w:rFonts w:ascii="Arial" w:eastAsia="Arial" w:hAnsi="Arial" w:cs="Arial"/>
                 <w:i/>
-              </w:rPr>
-            </w:pPr>
-            <w:proofErr w:type="spellStart"/>
-            <w:r>
-              <w:rPr>
-                <w:rFonts w:ascii="Arial" w:eastAsia="Arial" w:hAnsi="Arial" w:cs="Arial"/>
-                <w:i/>
-              </w:rPr>
-              <w:t>Interpret</w:t>
-            </w:r>
-            <w:proofErr w:type="spellEnd"/>
-            <w:r>
-              <w:rPr>
-                <w:rFonts w:ascii="Arial" w:eastAsia="Arial" w:hAnsi="Arial" w:cs="Arial"/>
-                <w:i/>
-              </w:rPr>
-              <w:t xml:space="preserve"> </w:t>
-            </w:r>
-            <w:proofErr w:type="spellStart"/>
-            <w:r>
-              <w:rPr>
-                <w:rFonts w:ascii="Arial" w:eastAsia="Arial" w:hAnsi="Arial" w:cs="Arial"/>
-                <w:i/>
-              </w:rPr>
-              <w:t>mechanical</w:t>
-            </w:r>
-            <w:proofErr w:type="spellEnd"/>
-            <w:r>
-              <w:rPr>
-                <w:rFonts w:ascii="Arial" w:eastAsia="Arial" w:hAnsi="Arial" w:cs="Arial"/>
-                <w:i/>
-              </w:rPr>
-              <w:t xml:space="preserve"> </w:t>
-            </w:r>
-            <w:proofErr w:type="spellStart"/>
-            <w:r>
-              <w:rPr>
-                <w:rFonts w:ascii="Arial" w:eastAsia="Arial" w:hAnsi="Arial" w:cs="Arial"/>
-                <w:i/>
-              </w:rPr>
-              <w:t>tests</w:t>
-            </w:r>
-            <w:proofErr w:type="spellEnd"/>
+                <w:lang w:val="en-GB"/>
+              </w:rPr>
+            </w:pPr>
+            <w:r>
+              <w:rPr>
+                <w:rFonts w:ascii="Arial" w:eastAsia="Arial" w:hAnsi="Arial" w:cs="Arial"/>
+                <w:i/>
+                <w:lang w:val="en-GB"/>
+              </w:rPr>
+              <w:t>Construct internal force diagrams to identify critical sections in structures subjected to various loading conditions.</w:t>
+            </w:r>
           </w:p>
           <w:p>
             <w:pPr>
@@ -2095,16 +2077,16 @@
               <w:rPr>
                 <w:rFonts w:ascii="Arial" w:eastAsia="Arial" w:hAnsi="Arial" w:cs="Arial"/>
                 <w:i/>
-                <w:lang w:val="en-US"/>
-              </w:rPr>
-            </w:pPr>
-            <w:r>
-              <w:rPr>
-                <w:rFonts w:ascii="Arial" w:eastAsia="Arial" w:hAnsi="Arial" w:cs="Arial"/>
-                <w:i/>
-                <w:lang w:val="en-US"/>
-              </w:rPr>
-              <w:t>Compare the performance of different materials</w:t>
+                <w:lang w:val="en-GB"/>
+              </w:rPr>
+            </w:pPr>
+            <w:r>
+              <w:rPr>
+                <w:rFonts w:ascii="Arial" w:eastAsia="Arial" w:hAnsi="Arial" w:cs="Arial"/>
+                <w:i/>
+                <w:lang w:val="en-GB"/>
+              </w:rPr>
+              <w:t>Correlate the nature of chemical bonding with the mechanical properties of materials, providing the rationale for choosing metals and polymers in engineering applications.</w:t>
             </w:r>
           </w:p>
           <w:p>
@@ -2117,33 +2099,35 @@
               <w:rPr>
                 <w:rFonts w:ascii="Arial" w:eastAsia="Arial" w:hAnsi="Arial" w:cs="Arial"/>
                 <w:i/>
-              </w:rPr>
-            </w:pPr>
+                <w:lang w:val="en-GB"/>
+              </w:rPr>
+            </w:pPr>
+            <w:r>
+              <w:rPr>
+                <w:rFonts w:ascii="Arial" w:eastAsia="Arial" w:hAnsi="Arial" w:cs="Arial"/>
+                <w:i/>
+                <w:lang w:val="en-GB"/>
+              </w:rPr>
+              <w:t xml:space="preserve">Perform laboratory mechanical testing (tensile and flexural), interpreting stress-strain curves for the characterization of </w:t>
+            </w:r>
             <w:proofErr w:type="spellStart"/>
             <w:r>
               <w:rPr>
                 <w:rFonts w:ascii="Arial" w:eastAsia="Arial" w:hAnsi="Arial" w:cs="Arial"/>
                 <w:i/>
-              </w:rPr>
-              <w:t>Calculate</w:t>
+                <w:lang w:val="en-GB"/>
+              </w:rPr>
+              <w:t>aluminum</w:t>
             </w:r>
             <w:proofErr w:type="spellEnd"/>
             <w:r>
               <w:rPr>
                 <w:rFonts w:ascii="Arial" w:eastAsia="Arial" w:hAnsi="Arial" w:cs="Arial"/>
                 <w:i/>
-              </w:rPr>
-              <w:t xml:space="preserve"> forces in </w:t>
-            </w:r>
-            <w:proofErr w:type="spellStart"/>
-            <w:r>
-              <w:rPr>
-                <w:rFonts w:ascii="Arial" w:eastAsia="Arial" w:hAnsi="Arial" w:cs="Arial"/>
-                <w:i/>
-              </w:rPr>
-              <w:t>bars</w:t>
-            </w:r>
-            <w:proofErr w:type="spellEnd"/>
+                <w:lang w:val="en-GB"/>
+              </w:rPr>
+              <w:t xml:space="preserve"> and plastics.</w:t>
+            </w:r>
           </w:p>
           <w:p>
             <w:pPr>
@@ -2155,17 +2139,28 @@
               <w:rPr>
                 <w:rFonts w:ascii="Arial" w:eastAsia="Arial" w:hAnsi="Arial" w:cs="Arial"/>
                 <w:i/>
+                <w:lang w:val="en-GB"/>
+              </w:rPr>
+            </w:pPr>
+            <w:r>
+              <w:rPr>
+                <w:rFonts w:ascii="Arial" w:eastAsia="Arial" w:hAnsi="Arial" w:cs="Arial"/>
+                <w:i/>
+                <w:lang w:val="en-GB"/>
+              </w:rPr>
+              <w:t>Apply material selection criteria and manufacturing processes based on performance requirements, cost, and physical properties.</w:t>
+            </w:r>
+          </w:p>
+          <w:p>
+            <w:pPr>
+              <w:widowControl/>
+              <w:ind w:left="360"/>
+              <w:rPr>
+                <w:rFonts w:ascii="Arial" w:eastAsia="Arial" w:hAnsi="Arial" w:cs="Arial"/>
+                <w:i/>
                 <w:lang w:val="en-US"/>
               </w:rPr>
             </w:pPr>
-            <w:r>
-              <w:rPr>
-                <w:rFonts w:ascii="Arial" w:eastAsia="Arial" w:hAnsi="Arial" w:cs="Arial"/>
-                <w:i/>
-                <w:lang w:val="en-US"/>
-              </w:rPr>
-              <w:t>Select and use fastening systems</w:t>
-            </w:r>
           </w:p>
         </w:tc>
       </w:tr>
@@ -2201,7 +2196,7 @@
               <w:rPr>
                 <w:rFonts w:ascii="Arial" w:eastAsia="Arial" w:hAnsi="Arial" w:cs="Arial"/>
                 <w:color w:val="000000"/>
-                <w:lang w:val="en-US"/>
+                <w:lang w:val="en-GB"/>
               </w:rPr>
             </w:pPr>
           </w:p>
@@ -2408,13 +2403,6 @@
                 <w:b/>
               </w:rPr>
             </w:pPr>
-            <w:r>
-              <w:rPr>
-                <w:rFonts w:ascii="Arial" w:eastAsia="Arial" w:hAnsi="Arial" w:cs="Arial"/>
-                <w:b/>
-              </w:rPr>
-              <w:t>285012</w:t>
-            </w:r>
           </w:p>
         </w:tc>
         <w:tc>
@@ -2524,7 +2512,7 @@
                 <w:rFonts w:ascii="Arial" w:eastAsia="Arial" w:hAnsi="Arial" w:cs="Arial"/>
                 <w:b/>
               </w:rPr>
-              <w:t xml:space="preserve">Ariana Lacorte </w:t>
+              <w:t xml:space="preserve">Rafael </w:t>
             </w:r>
             <w:proofErr w:type="spellStart"/>
             <w:r>
@@ -2532,7 +2520,7 @@
                 <w:rFonts w:ascii="Arial" w:eastAsia="Arial" w:hAnsi="Arial" w:cs="Arial"/>
                 <w:b/>
               </w:rPr>
-              <w:t>Caniato</w:t>
+              <w:t>Traldi</w:t>
             </w:r>
             <w:proofErr w:type="spellEnd"/>
             <w:r>
@@ -2540,7 +2528,14 @@
                 <w:rFonts w:ascii="Arial" w:eastAsia="Arial" w:hAnsi="Arial" w:cs="Arial"/>
                 <w:b/>
               </w:rPr>
-              <w:t xml:space="preserve"> Serrano</w:t>
+              <w:t xml:space="preserve"> Mour</w:t>
+            </w:r>
+            <w:r>
+              <w:rPr>
+                <w:rFonts w:ascii="Arial" w:eastAsia="Arial" w:hAnsi="Arial" w:cs="Arial"/>
+                <w:b/>
+              </w:rPr>
+              <w:t>a</w:t>
             </w:r>
           </w:p>
           <w:p>
@@ -2567,7 +2562,7 @@
                 <w:rFonts w:ascii="Arial" w:eastAsia="Arial" w:hAnsi="Arial" w:cs="Arial"/>
                 <w:b/>
               </w:rPr>
-              <w:t xml:space="preserve">Rafael </w:t>
+              <w:t xml:space="preserve">Rodrigo </w:t>
             </w:r>
             <w:proofErr w:type="spellStart"/>
             <w:r>
@@ -2575,7 +2570,7 @@
                 <w:rFonts w:ascii="Arial" w:eastAsia="Arial" w:hAnsi="Arial" w:cs="Arial"/>
                 <w:b/>
               </w:rPr>
-              <w:t>Traldi</w:t>
+              <w:t>Provasi</w:t>
             </w:r>
             <w:proofErr w:type="spellEnd"/>
             <w:r>
@@ -2583,7 +2578,7 @@
                 <w:rFonts w:ascii="Arial" w:eastAsia="Arial" w:hAnsi="Arial" w:cs="Arial"/>
                 <w:b/>
               </w:rPr>
-              <w:t xml:space="preserve"> Moura (?)</w:t>
+              <w:t xml:space="preserve"> Correia</w:t>
             </w:r>
           </w:p>
           <w:p>
@@ -2610,50 +2605,7 @@
                 <w:rFonts w:ascii="Arial" w:eastAsia="Arial" w:hAnsi="Arial" w:cs="Arial"/>
                 <w:b/>
               </w:rPr>
-              <w:t xml:space="preserve">Rodrigo </w:t>
-            </w:r>
-            <w:proofErr w:type="spellStart"/>
-            <w:r>
-              <w:rPr>
-                <w:rFonts w:ascii="Arial" w:eastAsia="Arial" w:hAnsi="Arial" w:cs="Arial"/>
-                <w:b/>
-              </w:rPr>
-              <w:t>Provasi</w:t>
-            </w:r>
-            <w:proofErr w:type="spellEnd"/>
-            <w:r>
-              <w:rPr>
-                <w:rFonts w:ascii="Arial" w:eastAsia="Arial" w:hAnsi="Arial" w:cs="Arial"/>
-                <w:b/>
-              </w:rPr>
-              <w:t xml:space="preserve"> Correia (?)</w:t>
-            </w:r>
-          </w:p>
-          <w:p>
-            <w:pPr>
-              <w:widowControl/>
-              <w:pBdr>
-                <w:top w:val="nil"/>
-                <w:left w:val="nil"/>
-                <w:bottom w:val="nil"/>
-                <w:right w:val="nil"/>
-                <w:between w:val="nil"/>
-              </w:pBdr>
-              <w:tabs>
-                <w:tab w:val="center" w:pos="4252"/>
-                <w:tab w:val="right" w:pos="8504"/>
-              </w:tabs>
-              <w:rPr>
-                <w:rFonts w:ascii="Arial" w:eastAsia="Arial" w:hAnsi="Arial" w:cs="Arial"/>
-                <w:b/>
-              </w:rPr>
-            </w:pPr>
-            <w:r>
-              <w:rPr>
-                <w:rFonts w:ascii="Arial" w:eastAsia="Arial" w:hAnsi="Arial" w:cs="Arial"/>
-                <w:b/>
-              </w:rPr>
-              <w:t>Eduardo Franco de Monlevade (?)</w:t>
+              <w:t>Eduardo Franco de Monlevade</w:t>
             </w:r>
           </w:p>
         </w:tc>
@@ -2697,6 +2649,7 @@
               <w:rPr>
                 <w:rFonts w:ascii="Arial" w:eastAsia="Arial" w:hAnsi="Arial" w:cs="Arial"/>
               </w:rPr>
+              <w:lastRenderedPageBreak/>
               <w:t xml:space="preserve">10. </w:t>
             </w:r>
             <w:r>
@@ -2836,104 +2789,51 @@
                 <w:rFonts w:ascii="Arial" w:eastAsia="Arial" w:hAnsi="Arial" w:cs="Arial"/>
                 <w:i/>
                 <w:color w:val="000000"/>
-              </w:rPr>
-            </w:pPr>
-            <w:proofErr w:type="spellStart"/>
-            <w:r>
-              <w:rPr>
-                <w:rFonts w:ascii="Arial" w:eastAsia="Arial" w:hAnsi="Arial" w:cs="Arial"/>
-                <w:i/>
-                <w:color w:val="000000"/>
-              </w:rPr>
-              <w:t>Electronic</w:t>
-            </w:r>
-            <w:proofErr w:type="spellEnd"/>
-            <w:r>
-              <w:rPr>
-                <w:rFonts w:ascii="Arial" w:eastAsia="Arial" w:hAnsi="Arial" w:cs="Arial"/>
-                <w:i/>
-                <w:color w:val="000000"/>
-              </w:rPr>
-              <w:t xml:space="preserve"> </w:t>
-            </w:r>
-            <w:proofErr w:type="spellStart"/>
-            <w:r>
-              <w:rPr>
-                <w:rFonts w:ascii="Arial" w:eastAsia="Arial" w:hAnsi="Arial" w:cs="Arial"/>
-                <w:i/>
-                <w:color w:val="000000"/>
-              </w:rPr>
-              <w:t>and</w:t>
-            </w:r>
-            <w:proofErr w:type="spellEnd"/>
-            <w:r>
-              <w:rPr>
-                <w:rFonts w:ascii="Arial" w:eastAsia="Arial" w:hAnsi="Arial" w:cs="Arial"/>
-                <w:i/>
-                <w:color w:val="000000"/>
-              </w:rPr>
-              <w:t xml:space="preserve"> </w:t>
-            </w:r>
-            <w:proofErr w:type="spellStart"/>
-            <w:r>
-              <w:rPr>
-                <w:rFonts w:ascii="Arial" w:eastAsia="Arial" w:hAnsi="Arial" w:cs="Arial"/>
-                <w:i/>
-                <w:color w:val="000000"/>
-              </w:rPr>
-              <w:t>Computational</w:t>
-            </w:r>
-            <w:proofErr w:type="spellEnd"/>
-            <w:r>
-              <w:rPr>
-                <w:rFonts w:ascii="Arial" w:eastAsia="Arial" w:hAnsi="Arial" w:cs="Arial"/>
-                <w:i/>
-                <w:color w:val="000000"/>
-              </w:rPr>
-              <w:t xml:space="preserve"> </w:t>
-            </w:r>
-            <w:proofErr w:type="spellStart"/>
-            <w:r>
-              <w:rPr>
-                <w:rFonts w:ascii="Arial" w:eastAsia="Arial" w:hAnsi="Arial" w:cs="Arial"/>
-                <w:i/>
-                <w:color w:val="000000"/>
-              </w:rPr>
-              <w:t>Sistems</w:t>
-            </w:r>
-            <w:proofErr w:type="spellEnd"/>
-            <w:r>
-              <w:rPr>
-                <w:rFonts w:ascii="Arial" w:eastAsia="Arial" w:hAnsi="Arial" w:cs="Arial"/>
-                <w:i/>
-                <w:color w:val="000000"/>
-              </w:rPr>
-              <w:t xml:space="preserve"> </w:t>
-            </w:r>
-            <w:proofErr w:type="spellStart"/>
-            <w:r>
-              <w:rPr>
-                <w:rFonts w:ascii="Arial" w:eastAsia="Arial" w:hAnsi="Arial" w:cs="Arial"/>
-                <w:i/>
-                <w:color w:val="000000"/>
-              </w:rPr>
-              <w:t>Engineering</w:t>
-            </w:r>
-            <w:proofErr w:type="spellEnd"/>
-          </w:p>
-          <w:p>
-            <w:pPr>
-              <w:widowControl/>
-              <w:pBdr>
-                <w:top w:val="nil"/>
-                <w:left w:val="nil"/>
-                <w:bottom w:val="nil"/>
-                <w:right w:val="nil"/>
-                <w:between w:val="nil"/>
-              </w:pBdr>
-              <w:rPr>
-                <w:rFonts w:ascii="Arial" w:eastAsia="Arial" w:hAnsi="Arial" w:cs="Arial"/>
-                <w:color w:val="000000"/>
+                <w:lang w:val="en-GB"/>
+              </w:rPr>
+            </w:pPr>
+            <w:r>
+              <w:rPr>
+                <w:rFonts w:ascii="Arial" w:eastAsia="Arial" w:hAnsi="Arial" w:cs="Arial"/>
+                <w:i/>
+                <w:color w:val="000000"/>
+                <w:lang w:val="en-GB"/>
+              </w:rPr>
+              <w:t>Electronic and Computational S</w:t>
+            </w:r>
+            <w:r>
+              <w:rPr>
+                <w:rFonts w:ascii="Arial" w:eastAsia="Arial" w:hAnsi="Arial" w:cs="Arial"/>
+                <w:i/>
+                <w:color w:val="000000"/>
+                <w:lang w:val="en-GB"/>
+              </w:rPr>
+              <w:t>y</w:t>
+            </w:r>
+            <w:r>
+              <w:rPr>
+                <w:rFonts w:ascii="Arial" w:eastAsia="Arial" w:hAnsi="Arial" w:cs="Arial"/>
+                <w:i/>
+                <w:color w:val="000000"/>
+                <w:lang w:val="en-GB"/>
+              </w:rPr>
+              <w:t>stems Engineering</w:t>
+            </w:r>
+          </w:p>
+          <w:p>
+            <w:pPr>
+              <w:widowControl/>
+              <w:pBdr>
+                <w:top w:val="nil"/>
+                <w:left w:val="nil"/>
+                <w:bottom w:val="nil"/>
+                <w:right w:val="nil"/>
+                <w:between w:val="nil"/>
+              </w:pBdr>
+              <w:rPr>
+                <w:rFonts w:ascii="Arial" w:eastAsia="Arial" w:hAnsi="Arial" w:cs="Arial"/>
+                <w:color w:val="000000"/>
+                <w:lang w:val="en-GB"/>
               </w:rPr>
             </w:pPr>
           </w:p>
@@ -2979,7 +2879,6 @@
               <w:rPr>
                 <w:rFonts w:ascii="Arial" w:eastAsia="Arial" w:hAnsi="Arial" w:cs="Arial"/>
               </w:rPr>
-              <w:lastRenderedPageBreak/>
               <w:t xml:space="preserve">11. </w:t>
             </w:r>
             <w:r>
@@ -3179,6 +3078,182 @@
               </w:rPr>
               <w:t>Em resumo, este curso oferece uma visão abrangente e prática dos sistemas mecânicos, capacitando os alunos a realizar análises e cálculos de esforços, entender as propriedades dos materiais e selecionar sistemas de fixação adequados. Essas habilidades são fundamentais para o sucesso na área de engenharia mecânica e garantem que os projetos sejam realizados com precisão, segurança e eficiência.</w:t>
             </w:r>
+          </w:p>
+          <w:p>
+            <w:pPr>
+              <w:widowControl/>
+              <w:pBdr>
+                <w:top w:val="nil"/>
+                <w:left w:val="nil"/>
+                <w:bottom w:val="nil"/>
+                <w:right w:val="nil"/>
+                <w:between w:val="nil"/>
+              </w:pBdr>
+              <w:jc w:val="both"/>
+              <w:rPr>
+                <w:rFonts w:ascii="Arial" w:eastAsia="Arial" w:hAnsi="Arial" w:cs="Arial"/>
+              </w:rPr>
+            </w:pPr>
+          </w:p>
+          <w:p>
+            <w:pPr>
+              <w:widowControl/>
+              <w:pBdr>
+                <w:top w:val="nil"/>
+                <w:left w:val="nil"/>
+                <w:bottom w:val="nil"/>
+                <w:right w:val="nil"/>
+                <w:between w:val="nil"/>
+              </w:pBdr>
+              <w:jc w:val="both"/>
+              <w:rPr>
+                <w:rFonts w:ascii="Arial" w:eastAsia="Arial" w:hAnsi="Arial" w:cs="Arial"/>
+                <w:lang w:val="pt-PT"/>
+              </w:rPr>
+            </w:pPr>
+            <w:r>
+              <w:rPr>
+                <w:rFonts w:ascii="Arial" w:eastAsia="Arial" w:hAnsi="Arial" w:cs="Arial"/>
+                <w:lang w:val="pt-PT"/>
+              </w:rPr>
+              <w:t>Conteúdos: Mecânica e Materiais</w:t>
+            </w:r>
+          </w:p>
+          <w:p>
+            <w:pPr>
+              <w:widowControl/>
+              <w:numPr>
+                <w:ilvl w:val="0"/>
+                <w:numId w:val="3"/>
+              </w:numPr>
+              <w:pBdr>
+                <w:top w:val="nil"/>
+                <w:left w:val="nil"/>
+                <w:bottom w:val="nil"/>
+                <w:right w:val="nil"/>
+                <w:between w:val="nil"/>
+              </w:pBdr>
+              <w:jc w:val="both"/>
+              <w:rPr>
+                <w:rFonts w:ascii="Arial" w:eastAsia="Arial" w:hAnsi="Arial" w:cs="Arial"/>
+                <w:lang w:val="pt-PT"/>
+              </w:rPr>
+            </w:pPr>
+            <w:r>
+              <w:rPr>
+                <w:rFonts w:ascii="Arial" w:eastAsia="Arial" w:hAnsi="Arial" w:cs="Arial"/>
+                <w:lang w:val="pt-PT"/>
+              </w:rPr>
+              <w:t>Sistemas Mecânicos: Projeto e dimensionamento de elementos de transmissão, sistemas de fixação e mancais</w:t>
+            </w:r>
+            <w:r>
+              <w:rPr>
+                <w:rFonts w:ascii="Arial" w:eastAsia="Arial" w:hAnsi="Arial" w:cs="Arial"/>
+                <w:lang w:val="pt-PT"/>
+              </w:rPr>
+              <w:t>.</w:t>
+            </w:r>
+          </w:p>
+          <w:p>
+            <w:pPr>
+              <w:widowControl/>
+              <w:numPr>
+                <w:ilvl w:val="0"/>
+                <w:numId w:val="3"/>
+              </w:numPr>
+              <w:pBdr>
+                <w:top w:val="nil"/>
+                <w:left w:val="nil"/>
+                <w:bottom w:val="nil"/>
+                <w:right w:val="nil"/>
+                <w:between w:val="nil"/>
+              </w:pBdr>
+              <w:jc w:val="both"/>
+              <w:rPr>
+                <w:rFonts w:ascii="Arial" w:eastAsia="Arial" w:hAnsi="Arial" w:cs="Arial"/>
+                <w:lang w:val="pt-PT"/>
+              </w:rPr>
+            </w:pPr>
+            <w:r>
+              <w:rPr>
+                <w:rFonts w:ascii="Arial" w:eastAsia="Arial" w:hAnsi="Arial" w:cs="Arial"/>
+                <w:lang w:val="pt-PT"/>
+              </w:rPr>
+              <w:t>Estática: Equilíbrio estático de corpos rígidos no plano (2D); determinação de reações de apoio e sistemas de forças equivalentes.</w:t>
+            </w:r>
+          </w:p>
+          <w:p>
+            <w:pPr>
+              <w:widowControl/>
+              <w:numPr>
+                <w:ilvl w:val="0"/>
+                <w:numId w:val="3"/>
+              </w:numPr>
+              <w:pBdr>
+                <w:top w:val="nil"/>
+                <w:left w:val="nil"/>
+                <w:bottom w:val="nil"/>
+                <w:right w:val="nil"/>
+                <w:between w:val="nil"/>
+              </w:pBdr>
+              <w:jc w:val="both"/>
+              <w:rPr>
+                <w:rFonts w:ascii="Arial" w:eastAsia="Arial" w:hAnsi="Arial" w:cs="Arial"/>
+                <w:lang w:val="pt-PT"/>
+              </w:rPr>
+            </w:pPr>
+            <w:r>
+              <w:rPr>
+                <w:rFonts w:ascii="Arial" w:eastAsia="Arial" w:hAnsi="Arial" w:cs="Arial"/>
+                <w:lang w:val="pt-PT"/>
+              </w:rPr>
+              <w:t>Estruturas: Análise de esforços solicitantes (axial, cortante e momento fletor) e elaboração de diagramas para elementos de barra (1D) e estruturas planares (2D).</w:t>
+            </w:r>
+          </w:p>
+          <w:p>
+            <w:pPr>
+              <w:widowControl/>
+              <w:numPr>
+                <w:ilvl w:val="0"/>
+                <w:numId w:val="3"/>
+              </w:numPr>
+              <w:pBdr>
+                <w:top w:val="nil"/>
+                <w:left w:val="nil"/>
+                <w:bottom w:val="nil"/>
+                <w:right w:val="nil"/>
+                <w:between w:val="nil"/>
+              </w:pBdr>
+              <w:jc w:val="both"/>
+              <w:rPr>
+                <w:rFonts w:ascii="Arial" w:eastAsia="Arial" w:hAnsi="Arial" w:cs="Arial"/>
+                <w:lang w:val="pt-PT"/>
+              </w:rPr>
+            </w:pPr>
+            <w:r>
+              <w:rPr>
+                <w:rFonts w:ascii="Arial" w:eastAsia="Arial" w:hAnsi="Arial" w:cs="Arial"/>
+                <w:lang w:val="pt-PT"/>
+              </w:rPr>
+              <w:t>Materiais: Fundamentos de ligações químicas, propriedades mecânicas e critérios de seleção de materiais; prática de ensaios laboratoriais de tração e flexão em alumínio e polímeros.</w:t>
+            </w:r>
+          </w:p>
+          <w:p>
+            <w:pPr>
+              <w:widowControl/>
+              <w:pBdr>
+                <w:top w:val="nil"/>
+                <w:left w:val="nil"/>
+                <w:bottom w:val="nil"/>
+                <w:right w:val="nil"/>
+                <w:between w:val="nil"/>
+              </w:pBdr>
+              <w:jc w:val="both"/>
+              <w:rPr>
+                <w:rFonts w:ascii="Arial" w:eastAsia="Arial" w:hAnsi="Arial" w:cs="Arial"/>
+                <w:lang w:val="pt-PT"/>
+              </w:rPr>
+            </w:pPr>
           </w:p>
           <w:p>
             <w:pPr>
@@ -3435,6 +3510,7 @@
               <w:rPr>
                 <w:rFonts w:ascii="Arial" w:eastAsia="Arial" w:hAnsi="Arial" w:cs="Arial"/>
               </w:rPr>
+              <w:lastRenderedPageBreak/>
               <w:t xml:space="preserve">12. </w:t>
             </w:r>
             <w:r>
@@ -3528,7 +3604,6 @@
                 <w:i/>
                 <w:lang w:val="en-US"/>
               </w:rPr>
-              <w:lastRenderedPageBreak/>
               <w:t>This course covers the study of mechanical systems, specifically focusing on fastening systems and appropriate selection techniques for assembling mechanical components. Additionally, students will calculate forces in bars, study material properties, and learn how to interpret mechanical tests to understand their characteristics, as well as compare the performance of different materials in specific applications.</w:t>
             </w:r>
           </w:p>
@@ -3590,7 +3665,6 @@
               <w:rPr>
                 <w:rFonts w:ascii="Arial" w:eastAsia="Arial" w:hAnsi="Arial" w:cs="Arial"/>
               </w:rPr>
-              <w:lastRenderedPageBreak/>
               <w:t xml:space="preserve">13. </w:t>
             </w:r>
             <w:r>
@@ -4249,6 +4323,7 @@
                 <w:rFonts w:ascii="Arial" w:eastAsia="Arial" w:hAnsi="Arial" w:cs="Arial"/>
                 <w:color w:val="000000"/>
               </w:rPr>
+              <w:lastRenderedPageBreak/>
               <w:t>16</w:t>
             </w:r>
             <w:r>
@@ -4883,11 +4958,127 @@
       </w:rPr>
     </w:lvl>
   </w:abstractNum>
+  <w:abstractNum w:abstractNumId="2" w15:restartNumberingAfterBreak="0">
+    <w:nsid w:val="6B5865DC"/>
+    <w:multiLevelType w:val="multilevel"/>
+    <w:tmpl w:val="D98A3FE6"/>
+    <w:lvl w:ilvl="0">
+      <w:start w:val="1"/>
+      <w:numFmt w:val="decimal"/>
+      <w:lvlText w:val="%1."/>
+      <w:lvlJc w:val="left"/>
+      <w:pPr>
+        <w:tabs>
+          <w:tab w:val="num" w:pos="720"/>
+        </w:tabs>
+        <w:ind w:left="720" w:hanging="360"/>
+      </w:pPr>
+    </w:lvl>
+    <w:lvl w:ilvl="1" w:tentative="1">
+      <w:start w:val="1"/>
+      <w:numFmt w:val="decimal"/>
+      <w:lvlText w:val="%2."/>
+      <w:lvlJc w:val="left"/>
+      <w:pPr>
+        <w:tabs>
+          <w:tab w:val="num" w:pos="1440"/>
+        </w:tabs>
+        <w:ind w:left="1440" w:hanging="360"/>
+      </w:pPr>
+    </w:lvl>
+    <w:lvl w:ilvl="2" w:tentative="1">
+      <w:start w:val="1"/>
+      <w:numFmt w:val="decimal"/>
+      <w:lvlText w:val="%3."/>
+      <w:lvlJc w:val="left"/>
+      <w:pPr>
+        <w:tabs>
+          <w:tab w:val="num" w:pos="2160"/>
+        </w:tabs>
+        <w:ind w:left="2160" w:hanging="360"/>
+      </w:pPr>
+    </w:lvl>
+    <w:lvl w:ilvl="3" w:tentative="1">
+      <w:start w:val="1"/>
+      <w:numFmt w:val="decimal"/>
+      <w:lvlText w:val="%4."/>
+      <w:lvlJc w:val="left"/>
+      <w:pPr>
+        <w:tabs>
+          <w:tab w:val="num" w:pos="2880"/>
+        </w:tabs>
+        <w:ind w:left="2880" w:hanging="360"/>
+      </w:pPr>
+    </w:lvl>
+    <w:lvl w:ilvl="4" w:tentative="1">
+      <w:start w:val="1"/>
+      <w:numFmt w:val="decimal"/>
+      <w:lvlText w:val="%5."/>
+      <w:lvlJc w:val="left"/>
+      <w:pPr>
+        <w:tabs>
+          <w:tab w:val="num" w:pos="3600"/>
+        </w:tabs>
+        <w:ind w:left="3600" w:hanging="360"/>
+      </w:pPr>
+    </w:lvl>
+    <w:lvl w:ilvl="5" w:tentative="1">
+      <w:start w:val="1"/>
+      <w:numFmt w:val="decimal"/>
+      <w:lvlText w:val="%6."/>
+      <w:lvlJc w:val="left"/>
+      <w:pPr>
+        <w:tabs>
+          <w:tab w:val="num" w:pos="4320"/>
+        </w:tabs>
+        <w:ind w:left="4320" w:hanging="360"/>
+      </w:pPr>
+    </w:lvl>
+    <w:lvl w:ilvl="6" w:tentative="1">
+      <w:start w:val="1"/>
+      <w:numFmt w:val="decimal"/>
+      <w:lvlText w:val="%7."/>
+      <w:lvlJc w:val="left"/>
+      <w:pPr>
+        <w:tabs>
+          <w:tab w:val="num" w:pos="5040"/>
+        </w:tabs>
+        <w:ind w:left="5040" w:hanging="360"/>
+      </w:pPr>
+    </w:lvl>
+    <w:lvl w:ilvl="7" w:tentative="1">
+      <w:start w:val="1"/>
+      <w:numFmt w:val="decimal"/>
+      <w:lvlText w:val="%8."/>
+      <w:lvlJc w:val="left"/>
+      <w:pPr>
+        <w:tabs>
+          <w:tab w:val="num" w:pos="5760"/>
+        </w:tabs>
+        <w:ind w:left="5760" w:hanging="360"/>
+      </w:pPr>
+    </w:lvl>
+    <w:lvl w:ilvl="8" w:tentative="1">
+      <w:start w:val="1"/>
+      <w:numFmt w:val="decimal"/>
+      <w:lvlText w:val="%9."/>
+      <w:lvlJc w:val="left"/>
+      <w:pPr>
+        <w:tabs>
+          <w:tab w:val="num" w:pos="6480"/>
+        </w:tabs>
+        <w:ind w:left="6480" w:hanging="360"/>
+      </w:pPr>
+    </w:lvl>
+  </w:abstractNum>
   <w:num w:numId="1" w16cid:durableId="429551550">
     <w:abstractNumId w:val="1"/>
   </w:num>
   <w:num w:numId="2" w16cid:durableId="449281371">
     <w:abstractNumId w:val="0"/>
+  </w:num>
+  <w:num w:numId="3" w16cid:durableId="1399085954">
+    <w:abstractNumId w:val="2"/>
   </w:num>
 </w:numbering>
 </file>
@@ -5289,7 +5480,7 @@
     <w:name w:val="Normal"/>
     <w:qFormat/>
   </w:style>
-  <w:style w:type="paragraph" w:styleId="Heading1">
+  <w:style w:type="paragraph" w:styleId="Ttulo1">
     <w:name w:val="heading 1"/>
     <w:basedOn w:val="Normal"/>
     <w:next w:val="Normal"/>
@@ -5314,7 +5505,7 @@
       <w:szCs w:val="32"/>
     </w:rPr>
   </w:style>
-  <w:style w:type="paragraph" w:styleId="Heading2">
+  <w:style w:type="paragraph" w:styleId="Ttulo2">
     <w:name w:val="heading 2"/>
     <w:basedOn w:val="Normal"/>
     <w:next w:val="Normal"/>
@@ -5344,7 +5535,7 @@
       <w:szCs w:val="28"/>
     </w:rPr>
   </w:style>
-  <w:style w:type="paragraph" w:styleId="Heading3">
+  <w:style w:type="paragraph" w:styleId="Ttulo3">
     <w:name w:val="heading 3"/>
     <w:basedOn w:val="Normal"/>
     <w:next w:val="Normal"/>
@@ -5373,7 +5564,7 @@
       <w:szCs w:val="26"/>
     </w:rPr>
   </w:style>
-  <w:style w:type="paragraph" w:styleId="Heading4">
+  <w:style w:type="paragraph" w:styleId="Ttulo4">
     <w:name w:val="heading 4"/>
     <w:basedOn w:val="Normal"/>
     <w:next w:val="Normal"/>
@@ -5401,7 +5592,7 @@
       <w:szCs w:val="28"/>
     </w:rPr>
   </w:style>
-  <w:style w:type="paragraph" w:styleId="Heading5">
+  <w:style w:type="paragraph" w:styleId="Ttulo5">
     <w:name w:val="heading 5"/>
     <w:basedOn w:val="Normal"/>
     <w:next w:val="Normal"/>
@@ -5433,7 +5624,7 @@
       <w:szCs w:val="26"/>
     </w:rPr>
   </w:style>
-  <w:style w:type="paragraph" w:styleId="Heading6">
+  <w:style w:type="paragraph" w:styleId="Ttulo6">
     <w:name w:val="heading 6"/>
     <w:basedOn w:val="Normal"/>
     <w:next w:val="Normal"/>
@@ -5459,13 +5650,12 @@
       <w:color w:val="000000"/>
     </w:rPr>
   </w:style>
-  <w:style w:type="character" w:default="1" w:styleId="DefaultParagraphFont">
+  <w:style w:type="character" w:default="1" w:styleId="Fontepargpadro">
     <w:name w:val="Default Paragraph Font"/>
     <w:uiPriority w:val="1"/>
-    <w:semiHidden/>
     <w:unhideWhenUsed/>
   </w:style>
-  <w:style w:type="table" w:default="1" w:styleId="TableNormal">
+  <w:style w:type="table" w:default="1" w:styleId="Tabelanormal">
     <w:name w:val="Normal Table"/>
     <w:uiPriority w:val="99"/>
     <w:semiHidden/>
@@ -5480,13 +5670,13 @@
       </w:tblCellMar>
     </w:tblPr>
   </w:style>
-  <w:style w:type="numbering" w:default="1" w:styleId="NoList">
+  <w:style w:type="numbering" w:default="1" w:styleId="Semlista">
     <w:name w:val="No List"/>
     <w:uiPriority w:val="99"/>
     <w:semiHidden/>
     <w:unhideWhenUsed/>
   </w:style>
-  <w:style w:type="table" w:customStyle="1" w:styleId="TableNormal0">
+  <w:style w:type="table" w:customStyle="1" w:styleId="TableNormal">
     <w:name w:val="TableNormal"/>
     <w:tblPr>
       <w:tblCellMar>
@@ -5497,7 +5687,7 @@
       </w:tblCellMar>
     </w:tblPr>
   </w:style>
-  <w:style w:type="paragraph" w:styleId="Title">
+  <w:style w:type="paragraph" w:styleId="Ttulo">
     <w:name w:val="Title"/>
     <w:basedOn w:val="Normal"/>
     <w:next w:val="Normal"/>
@@ -5514,7 +5704,7 @@
       <w:szCs w:val="72"/>
     </w:rPr>
   </w:style>
-  <w:style w:type="table" w:customStyle="1" w:styleId="TableNormal1">
+  <w:style w:type="table" w:customStyle="1" w:styleId="TableNormal0">
     <w:name w:val="TableNormal"/>
     <w:tblPr>
       <w:tblCellMar>
@@ -5526,7 +5716,7 @@
     </w:tblPr>
   </w:style>
   <w:style w:type="table" w:customStyle="1" w:styleId="a">
-    <w:basedOn w:val="TableNormal1"/>
+    <w:basedOn w:val="TableNormal0"/>
     <w:tblPr>
       <w:tblStyleRowBandSize w:val="1"/>
       <w:tblStyleColBandSize w:val="1"/>
@@ -5537,7 +5727,7 @@
     </w:tblPr>
   </w:style>
   <w:style w:type="table" w:customStyle="1" w:styleId="a0">
-    <w:basedOn w:val="TableNormal1"/>
+    <w:basedOn w:val="TableNormal0"/>
     <w:tblPr>
       <w:tblStyleRowBandSize w:val="1"/>
       <w:tblStyleColBandSize w:val="1"/>
@@ -5547,10 +5737,10 @@
       </w:tblCellMar>
     </w:tblPr>
   </w:style>
-  <w:style w:type="paragraph" w:styleId="Header">
+  <w:style w:type="paragraph" w:styleId="Cabealho">
     <w:name w:val="header"/>
     <w:basedOn w:val="Normal"/>
-    <w:link w:val="HeaderChar"/>
+    <w:link w:val="CabealhoChar"/>
     <w:uiPriority w:val="99"/>
     <w:unhideWhenUsed/>
     <w:rsid w:val="00445BA4"/>
@@ -5561,17 +5751,17 @@
       </w:tabs>
     </w:pPr>
   </w:style>
-  <w:style w:type="character" w:customStyle="1" w:styleId="HeaderChar">
-    <w:name w:val="Header Char"/>
-    <w:basedOn w:val="DefaultParagraphFont"/>
-    <w:link w:val="Header"/>
+  <w:style w:type="character" w:customStyle="1" w:styleId="CabealhoChar">
+    <w:name w:val="Cabeçalho Char"/>
+    <w:basedOn w:val="Fontepargpadro"/>
+    <w:link w:val="Cabealho"/>
     <w:uiPriority w:val="99"/>
     <w:rsid w:val="00445BA4"/>
   </w:style>
-  <w:style w:type="paragraph" w:styleId="Footer">
+  <w:style w:type="paragraph" w:styleId="Rodap">
     <w:name w:val="footer"/>
     <w:basedOn w:val="Normal"/>
-    <w:link w:val="FooterChar"/>
+    <w:link w:val="RodapChar"/>
     <w:uiPriority w:val="99"/>
     <w:unhideWhenUsed/>
     <w:rsid w:val="00445BA4"/>
@@ -5582,14 +5772,14 @@
       </w:tabs>
     </w:pPr>
   </w:style>
-  <w:style w:type="character" w:customStyle="1" w:styleId="FooterChar">
-    <w:name w:val="Footer Char"/>
-    <w:basedOn w:val="DefaultParagraphFont"/>
-    <w:link w:val="Footer"/>
+  <w:style w:type="character" w:customStyle="1" w:styleId="RodapChar">
+    <w:name w:val="Rodapé Char"/>
+    <w:basedOn w:val="Fontepargpadro"/>
+    <w:link w:val="Rodap"/>
     <w:uiPriority w:val="99"/>
     <w:rsid w:val="00445BA4"/>
   </w:style>
-  <w:style w:type="paragraph" w:styleId="Subtitle">
+  <w:style w:type="paragraph" w:styleId="Subttulo">
     <w:name w:val="Subtitle"/>
     <w:basedOn w:val="Normal"/>
     <w:next w:val="Normal"/>
@@ -5609,7 +5799,7 @@
     </w:rPr>
   </w:style>
   <w:style w:type="table" w:customStyle="1" w:styleId="a1">
-    <w:basedOn w:val="TableNormal1"/>
+    <w:basedOn w:val="TableNormal0"/>
     <w:tblPr>
       <w:tblStyleRowBandSize w:val="1"/>
       <w:tblStyleColBandSize w:val="1"/>
@@ -5620,7 +5810,7 @@
     </w:tblPr>
   </w:style>
   <w:style w:type="table" w:customStyle="1" w:styleId="a2">
-    <w:basedOn w:val="TableNormal1"/>
+    <w:basedOn w:val="TableNormal0"/>
     <w:tblPr>
       <w:tblStyleRowBandSize w:val="1"/>
       <w:tblStyleColBandSize w:val="1"/>

</xml_diff>

<commit_message>
V1 - pequenas modificações
</commit_message>
<xml_diff>
--- a/1o semestre/030XXXX- Mecânica e Materiais 1.docx
+++ b/1o semestre/030XXXX- Mecânica e Materiais 1.docx
@@ -1917,23 +1917,7 @@
                 <w:i/>
                 <w:lang w:val="en-US"/>
               </w:rPr>
-              <w:t xml:space="preserve">Electronic and Computational </w:t>
-            </w:r>
-            <w:r>
-              <w:rPr>
-                <w:rFonts w:ascii="Arial" w:eastAsia="Arial" w:hAnsi="Arial" w:cs="Arial"/>
-                <w:i/>
-                <w:lang w:val="en-US"/>
-              </w:rPr>
-              <w:t>Systems</w:t>
-            </w:r>
-            <w:r>
-              <w:rPr>
-                <w:rFonts w:ascii="Arial" w:eastAsia="Arial" w:hAnsi="Arial" w:cs="Arial"/>
-                <w:i/>
-                <w:lang w:val="en-US"/>
-              </w:rPr>
-              <w:t xml:space="preserve"> Engineering</w:t>
+              <w:t>Electronic and Computational Systems Engineering</w:t>
             </w:r>
             <w:r>
               <w:rPr>
@@ -2528,14 +2512,7 @@
                 <w:rFonts w:ascii="Arial" w:eastAsia="Arial" w:hAnsi="Arial" w:cs="Arial"/>
                 <w:b/>
               </w:rPr>
-              <w:t xml:space="preserve"> Mour</w:t>
-            </w:r>
-            <w:r>
-              <w:rPr>
-                <w:rFonts w:ascii="Arial" w:eastAsia="Arial" w:hAnsi="Arial" w:cs="Arial"/>
-                <w:b/>
-              </w:rPr>
-              <w:t>a</w:t>
+              <w:t xml:space="preserve"> Moura</w:t>
             </w:r>
           </w:p>
           <w:p>
@@ -3468,6 +3445,143 @@
                 <w:lang w:val="en-US"/>
               </w:rPr>
             </w:pPr>
+            <w:r>
+              <w:rPr>
+                <w:rFonts w:ascii="Arial" w:eastAsia="Arial" w:hAnsi="Arial" w:cs="Arial"/>
+                <w:i/>
+                <w:lang w:val="en-US"/>
+              </w:rPr>
+              <w:t>Course Content: Mechanics and Materials</w:t>
+            </w:r>
+          </w:p>
+          <w:p>
+            <w:pPr>
+              <w:pStyle w:val="PargrafodaLista"/>
+              <w:widowControl/>
+              <w:numPr>
+                <w:ilvl w:val="0"/>
+                <w:numId w:val="4"/>
+              </w:numPr>
+              <w:jc w:val="both"/>
+              <w:rPr>
+                <w:rFonts w:ascii="Arial" w:eastAsia="Arial" w:hAnsi="Arial" w:cs="Arial"/>
+                <w:i/>
+                <w:lang w:val="en-US"/>
+              </w:rPr>
+            </w:pPr>
+            <w:r>
+              <w:rPr>
+                <w:rFonts w:ascii="Arial" w:eastAsia="Arial" w:hAnsi="Arial" w:cs="Arial"/>
+                <w:i/>
+                <w:lang w:val="en-US"/>
+              </w:rPr>
+              <w:t>Mechanical Systems: Design and sizing of transmission elements, fastening systems, and bearings.</w:t>
+            </w:r>
+          </w:p>
+          <w:p>
+            <w:pPr>
+              <w:widowControl/>
+              <w:jc w:val="both"/>
+              <w:rPr>
+                <w:rFonts w:ascii="Arial" w:eastAsia="Arial" w:hAnsi="Arial" w:cs="Arial"/>
+                <w:i/>
+                <w:lang w:val="en-US"/>
+              </w:rPr>
+            </w:pPr>
+          </w:p>
+          <w:p>
+            <w:pPr>
+              <w:pStyle w:val="PargrafodaLista"/>
+              <w:widowControl/>
+              <w:numPr>
+                <w:ilvl w:val="0"/>
+                <w:numId w:val="4"/>
+              </w:numPr>
+              <w:jc w:val="both"/>
+              <w:rPr>
+                <w:rFonts w:ascii="Arial" w:eastAsia="Arial" w:hAnsi="Arial" w:cs="Arial"/>
+                <w:i/>
+                <w:lang w:val="en-US"/>
+              </w:rPr>
+            </w:pPr>
+            <w:r>
+              <w:rPr>
+                <w:rFonts w:ascii="Arial" w:eastAsia="Arial" w:hAnsi="Arial" w:cs="Arial"/>
+                <w:i/>
+                <w:lang w:val="en-US"/>
+              </w:rPr>
+              <w:t>Statics: Static equilibrium of rigid bodies in the plane (2D); determination of support reactions and equivalent force systems.</w:t>
+            </w:r>
+          </w:p>
+          <w:p>
+            <w:pPr>
+              <w:widowControl/>
+              <w:jc w:val="both"/>
+              <w:rPr>
+                <w:rFonts w:ascii="Arial" w:eastAsia="Arial" w:hAnsi="Arial" w:cs="Arial"/>
+                <w:i/>
+                <w:lang w:val="en-US"/>
+              </w:rPr>
+            </w:pPr>
+          </w:p>
+          <w:p>
+            <w:pPr>
+              <w:pStyle w:val="PargrafodaLista"/>
+              <w:widowControl/>
+              <w:numPr>
+                <w:ilvl w:val="0"/>
+                <w:numId w:val="4"/>
+              </w:numPr>
+              <w:jc w:val="both"/>
+              <w:rPr>
+                <w:rFonts w:ascii="Arial" w:eastAsia="Arial" w:hAnsi="Arial" w:cs="Arial"/>
+                <w:i/>
+                <w:lang w:val="en-US"/>
+              </w:rPr>
+            </w:pPr>
+            <w:r>
+              <w:rPr>
+                <w:rFonts w:ascii="Arial" w:eastAsia="Arial" w:hAnsi="Arial" w:cs="Arial"/>
+                <w:i/>
+                <w:lang w:val="en-US"/>
+              </w:rPr>
+              <w:t>Structures: Internal loading analysis (axial, shear, and bending moment) and development of diagrams for beam elements (1D) and planar structures (2D).</w:t>
+            </w:r>
+          </w:p>
+          <w:p>
+            <w:pPr>
+              <w:widowControl/>
+              <w:jc w:val="both"/>
+              <w:rPr>
+                <w:rFonts w:ascii="Arial" w:eastAsia="Arial" w:hAnsi="Arial" w:cs="Arial"/>
+                <w:i/>
+                <w:lang w:val="en-US"/>
+              </w:rPr>
+            </w:pPr>
+          </w:p>
+          <w:p>
+            <w:pPr>
+              <w:pStyle w:val="PargrafodaLista"/>
+              <w:widowControl/>
+              <w:numPr>
+                <w:ilvl w:val="0"/>
+                <w:numId w:val="4"/>
+              </w:numPr>
+              <w:jc w:val="both"/>
+              <w:rPr>
+                <w:rFonts w:ascii="Arial" w:eastAsia="Arial" w:hAnsi="Arial" w:cs="Arial"/>
+                <w:i/>
+                <w:lang w:val="en-US"/>
+              </w:rPr>
+            </w:pPr>
+            <w:r>
+              <w:rPr>
+                <w:rFonts w:ascii="Arial" w:eastAsia="Arial" w:hAnsi="Arial" w:cs="Arial"/>
+                <w:i/>
+                <w:lang w:val="en-US"/>
+              </w:rPr>
+              <w:t>Materials: Fundamentals of chemical bonding, mechanical properties, and material selection criteria; laboratory practice of tensile and flexural testing for aluminum and polymers.</w:t>
+            </w:r>
           </w:p>
         </w:tc>
       </w:tr>
@@ -4846,6 +4960,92 @@
     </w:lvl>
   </w:abstractNum>
   <w:abstractNum w:abstractNumId="1" w15:restartNumberingAfterBreak="0">
+    <w:nsid w:val="0D01039C"/>
+    <w:multiLevelType w:val="hybridMultilevel"/>
+    <w:tmpl w:val="444ED7DA"/>
+    <w:lvl w:ilvl="0" w:tplc="0816000F">
+      <w:start w:val="1"/>
+      <w:numFmt w:val="decimal"/>
+      <w:lvlText w:val="%1."/>
+      <w:lvlJc w:val="left"/>
+      <w:pPr>
+        <w:ind w:left="720" w:hanging="360"/>
+      </w:pPr>
+    </w:lvl>
+    <w:lvl w:ilvl="1" w:tplc="08160019" w:tentative="1">
+      <w:start w:val="1"/>
+      <w:numFmt w:val="lowerLetter"/>
+      <w:lvlText w:val="%2."/>
+      <w:lvlJc w:val="left"/>
+      <w:pPr>
+        <w:ind w:left="1440" w:hanging="360"/>
+      </w:pPr>
+    </w:lvl>
+    <w:lvl w:ilvl="2" w:tplc="0816001B" w:tentative="1">
+      <w:start w:val="1"/>
+      <w:numFmt w:val="lowerRoman"/>
+      <w:lvlText w:val="%3."/>
+      <w:lvlJc w:val="right"/>
+      <w:pPr>
+        <w:ind w:left="2160" w:hanging="180"/>
+      </w:pPr>
+    </w:lvl>
+    <w:lvl w:ilvl="3" w:tplc="0816000F" w:tentative="1">
+      <w:start w:val="1"/>
+      <w:numFmt w:val="decimal"/>
+      <w:lvlText w:val="%4."/>
+      <w:lvlJc w:val="left"/>
+      <w:pPr>
+        <w:ind w:left="2880" w:hanging="360"/>
+      </w:pPr>
+    </w:lvl>
+    <w:lvl w:ilvl="4" w:tplc="08160019" w:tentative="1">
+      <w:start w:val="1"/>
+      <w:numFmt w:val="lowerLetter"/>
+      <w:lvlText w:val="%5."/>
+      <w:lvlJc w:val="left"/>
+      <w:pPr>
+        <w:ind w:left="3600" w:hanging="360"/>
+      </w:pPr>
+    </w:lvl>
+    <w:lvl w:ilvl="5" w:tplc="0816001B" w:tentative="1">
+      <w:start w:val="1"/>
+      <w:numFmt w:val="lowerRoman"/>
+      <w:lvlText w:val="%6."/>
+      <w:lvlJc w:val="right"/>
+      <w:pPr>
+        <w:ind w:left="4320" w:hanging="180"/>
+      </w:pPr>
+    </w:lvl>
+    <w:lvl w:ilvl="6" w:tplc="0816000F" w:tentative="1">
+      <w:start w:val="1"/>
+      <w:numFmt w:val="decimal"/>
+      <w:lvlText w:val="%7."/>
+      <w:lvlJc w:val="left"/>
+      <w:pPr>
+        <w:ind w:left="5040" w:hanging="360"/>
+      </w:pPr>
+    </w:lvl>
+    <w:lvl w:ilvl="7" w:tplc="08160019" w:tentative="1">
+      <w:start w:val="1"/>
+      <w:numFmt w:val="lowerLetter"/>
+      <w:lvlText w:val="%8."/>
+      <w:lvlJc w:val="left"/>
+      <w:pPr>
+        <w:ind w:left="5760" w:hanging="360"/>
+      </w:pPr>
+    </w:lvl>
+    <w:lvl w:ilvl="8" w:tplc="0816001B" w:tentative="1">
+      <w:start w:val="1"/>
+      <w:numFmt w:val="lowerRoman"/>
+      <w:lvlText w:val="%9."/>
+      <w:lvlJc w:val="right"/>
+      <w:pPr>
+        <w:ind w:left="6480" w:hanging="180"/>
+      </w:pPr>
+    </w:lvl>
+  </w:abstractNum>
+  <w:abstractNum w:abstractNumId="2" w15:restartNumberingAfterBreak="0">
     <w:nsid w:val="32D2553C"/>
     <w:multiLevelType w:val="multilevel"/>
     <w:tmpl w:val="D4AC47FE"/>
@@ -4958,7 +5158,7 @@
       </w:rPr>
     </w:lvl>
   </w:abstractNum>
-  <w:abstractNum w:abstractNumId="2" w15:restartNumberingAfterBreak="0">
+  <w:abstractNum w:abstractNumId="3" w15:restartNumberingAfterBreak="0">
     <w:nsid w:val="6B5865DC"/>
     <w:multiLevelType w:val="multilevel"/>
     <w:tmpl w:val="D98A3FE6"/>
@@ -5072,13 +5272,16 @@
     </w:lvl>
   </w:abstractNum>
   <w:num w:numId="1" w16cid:durableId="429551550">
-    <w:abstractNumId w:val="1"/>
+    <w:abstractNumId w:val="2"/>
   </w:num>
   <w:num w:numId="2" w16cid:durableId="449281371">
     <w:abstractNumId w:val="0"/>
   </w:num>
   <w:num w:numId="3" w16cid:durableId="1399085954">
-    <w:abstractNumId w:val="2"/>
+    <w:abstractNumId w:val="3"/>
+  </w:num>
+  <w:num w:numId="4" w16cid:durableId="1938636253">
+    <w:abstractNumId w:val="1"/>
   </w:num>
 </w:numbering>
 </file>
@@ -5653,6 +5856,7 @@
   <w:style w:type="character" w:default="1" w:styleId="Fontepargpadro">
     <w:name w:val="Default Paragraph Font"/>
     <w:uiPriority w:val="1"/>
+    <w:semiHidden/>
     <w:unhideWhenUsed/>
   </w:style>
   <w:style w:type="table" w:default="1" w:styleId="Tabelanormal">
@@ -5819,6 +6023,17 @@
         <w:right w:w="10" w:type="dxa"/>
       </w:tblCellMar>
     </w:tblPr>
+  </w:style>
+  <w:style w:type="paragraph" w:styleId="PargrafodaLista">
+    <w:name w:val="List Paragraph"/>
+    <w:basedOn w:val="Normal"/>
+    <w:uiPriority w:val="34"/>
+    <w:qFormat/>
+    <w:rsid w:val="00225A5E"/>
+    <w:pPr>
+      <w:ind w:left="720"/>
+      <w:contextualSpacing/>
+    </w:pPr>
   </w:style>
 </w:styles>
 </file>

</xml_diff>